<commit_message>
docs(lab03): instrumento ABET con joint_1 y lectura de /joint_states por nombre
El instrumento ABET del Laboratorio 03 seguía evaluando el turno con
joint_6 (±0.05 a ±0.08 rad) y el límite viejo de 0.10 rad, mientras la
guía ya usa joint_1 (±0.20 a ±0.30 rad) con max_joint_delta_rad = 0.35.
Se actualizan C4, E7, la Tabla 4, la pregunta 8, la pregunta 3 del
Anexo A y el nivel N4 (versión 1.1).

En la guía, la lectura de /joint_states se alinea con la ruta de inicio:
se arma la meta por el campo name y se omite la articulación de la pinza
que llega con el robot real. Se corrige la referencia al radio libre
(regla 3) y la observación del turno (giro de la base). Ambos Word se
regeneran con sus scripts.

Co-Authored-By: Claude Opus 5.5 <noreply@anthropic.com>
Claude-Session: https://claude.ai/code/session_01A4jArrxa1RLtDdQTQFnPXP
</commit_message>
<xml_diff>
--- a/education/evidencias_abet/INSTRUMENTO_ABET_LAB_03_OPERACION_DISTRIBUIDA_KINOVA_TURNOS.docx
+++ b/education/evidencias_abet/INSTRUMENTO_ABET_LAB_03_OPERACION_DISTRIBUIDA_KINOVA_TURNOS.docx
@@ -46,7 +46,7 @@
                 <w:b w:val="0"/>
                 <w:sz w:val="16"/>
               </w:rPr>
-              <w:t>DOCUMENTO ÚNICO DE ENTREGA Y EVALUACIÓN ABET — Versión 1.0 (2026-2). Asociado a la Guía de Laboratorio 03 (GL-AA-F-1). Este instrumento contiene el informe técnico integral: las 5 tablas de registro experimental llenadas por el equipo, el cuestionario de análisis técnico respondido, el Anexo A de comprobación individual para certificar el logro de cada integrante y la rúbrica analítica docente para calificación sobre 500 y 5,0. La nota académica no se interpreta como nivel ABET agregado.</w:t>
+              <w:t>DOCUMENTO ÚNICO DE ENTREGA Y EVALUACIÓN ABET — Versión 1.1 (2026-2). Asociado a la Guía de Laboratorio 03 (GL-AA-F-1). Este instrumento contiene el informe técnico integral: las 5 tablas de registro experimental llenadas por el equipo, el cuestionario de análisis técnico respondido, el Anexo A de comprobación individual para certificar el logro de cada integrante y la rúbrica analítica docente para calificación sobre 500 y 5,0. La nota académica no se interpreta como nivel ABET agregado.</w:t>
             </w:r>
           </w:p>
         </w:tc>
@@ -725,7 +725,7 @@
                 <w:b w:val="0"/>
                 <w:sz w:val="15"/>
               </w:rPr>
-              <w:t>Versión 1.0 (2026-2)</w:t>
+              <w:t>Versión 1.1 (2026-2)</w:t>
             </w:r>
           </w:p>
         </w:tc>
@@ -2099,7 +2099,7 @@
                 <w:b w:val="0"/>
                 <w:sz w:val="15"/>
               </w:rPr>
-              <w:t>Modo seco (dry_run:=true, cód 0), joint_6 visible, Tabla 4</w:t>
+              <w:t>Modo seco (dry_run:=true, cód 0), giro de joint_1 visible, Tabla 4</w:t>
             </w:r>
           </w:p>
         </w:tc>
@@ -2687,7 +2687,7 @@
                 <w:b w:val="0"/>
                 <w:sz w:val="15"/>
               </w:rPr>
-              <w:t>Captura de envío real al Kinova Gen3, mostrando el cambio angular en joint_6 (±0.05 a ±0.08 rad) verificado.</w:t>
+              <w:t>Captura de envío real al Kinova Gen3, mostrando el giro de la base en joint_1 (±0.20 a ±0.30 rad), el cierre SUCCESSFUL y la pose final en /joint_states.</w:t>
             </w:r>
           </w:p>
         </w:tc>
@@ -5465,7 +5465,7 @@
                 <w:color w:val="FFFFFF"/>
                 <w:sz w:val="15"/>
               </w:rPr>
-              <w:t>joint_6 Inicial (rad)</w:t>
+              <w:t>joint_1 Inicial (rad)</w:t>
             </w:r>
           </w:p>
         </w:tc>
@@ -5487,7 +5487,7 @@
                 <w:color w:val="FFFFFF"/>
                 <w:sz w:val="15"/>
               </w:rPr>
-              <w:t>Meta joint_6 (rad)</w:t>
+              <w:t>Meta joint_1 (rad)</w:t>
             </w:r>
           </w:p>
         </w:tc>
@@ -5553,7 +5553,7 @@
                 <w:color w:val="FFFFFF"/>
                 <w:sz w:val="15"/>
               </w:rPr>
-              <w:t>joint_6 Final (rad)</w:t>
+              <w:t>joint_1 Final (rad)</w:t>
             </w:r>
           </w:p>
         </w:tc>
@@ -5692,7 +5692,7 @@
                 <w:b w:val="0"/>
                 <w:sz w:val="15"/>
               </w:rPr>
-              <w:t>(+0.05 a +0.08)</w:t>
+              <w:t>(+0.20 a +0.30)</w:t>
             </w:r>
           </w:p>
         </w:tc>
@@ -5884,7 +5884,7 @@
                 <w:b w:val="0"/>
                 <w:sz w:val="15"/>
               </w:rPr>
-              <w:t>(-0.05 a -0.08)</w:t>
+              <w:t>(-0.20 a -0.30)</w:t>
             </w:r>
           </w:p>
         </w:tc>
@@ -6076,7 +6076,7 @@
                 <w:b w:val="0"/>
                 <w:sz w:val="15"/>
               </w:rPr>
-              <w:t>(+0.05 a +0.08)</w:t>
+              <w:t>(+0.20 a +0.30)</w:t>
             </w:r>
           </w:p>
         </w:tc>
@@ -6268,7 +6268,7 @@
                 <w:b w:val="0"/>
                 <w:sz w:val="15"/>
               </w:rPr>
-              <w:t>(-0.05 a -0.08)</w:t>
+              <w:t>(-0.20 a -0.30)</w:t>
             </w:r>
           </w:p>
         </w:tc>
@@ -6460,7 +6460,7 @@
                 <w:b w:val="0"/>
                 <w:sz w:val="15"/>
               </w:rPr>
-              <w:t>(+0.05 a +0.08)</w:t>
+              <w:t>(+0.20 a +0.30)</w:t>
             </w:r>
           </w:p>
         </w:tc>
@@ -7560,7 +7560,7 @@
         </w:rPr>
         <w:t>Pregunta 8: Posicionamiento Absoluto vs. Deltas Relativos y Autodescubrimiento de Pose</w:t>
         <w:br/>
-        <w:t>Compare la operación de safe_trajectory_client frente a safe_sequence_client. ¿Por qué en el cliente individual fue estrictamente necesario descubrir las posiciones absolutas reales de /joint_states antes de formular la meta para evitar el bloqueo por max_joint_delta_rad (0.10 rad), mientras que el cliente de secuencia pudo ejecutarse desde cualquier pose sin transcribir coordenadas a mano? ¿Qué riesgos y ventajas de seguridad introduce cada enfoque en entornos industriales colaborativos?</w:t>
+        <w:t>Compare la operación de safe_trajectory_client frente a safe_sequence_client. ¿Por qué en el cliente individual fue estrictamente necesario descubrir las posiciones absolutas reales de /joint_states antes de formular la meta para evitar el bloqueo por max_joint_delta_rad (0.35 rad), mientras que el cliente de secuencia pudo ejecutarse desde cualquier pose sin transcribir coordenadas a mano? ¿Qué riesgos y ventajas de seguridad introduce cada enfoque en entornos industriales colaborativos?</w:t>
       </w:r>
     </w:p>
     <w:tbl>
@@ -7805,7 +7805,7 @@
                 <w:b w:val="0"/>
                 <w:sz w:val="15"/>
               </w:rPr>
-              <w:t>3. Explicación del Modo Seco y deltas angulares: Justifique técnicamente qué valida el cliente en modo seco (dry_run:=true) y por qué se restringió el desplazamiento de joint_6 a un rango de ±0.05 a ±0.08 rad.</w:t>
+              <w:t>3. Explicación del Modo Seco y deltas angulares: Justifique técnicamente qué valida el cliente en modo seco (dry_run:=true) y por qué el turno mueve joint_1 entre ±0.20 y ±0.30 rad, con max_joint_delta_rad = 0.35 rad, y qué exige de la celda que ese giro desplace todo el brazo.</w:t>
             </w:r>
           </w:p>
         </w:tc>
@@ -8078,7 +8078,7 @@
                 <w:b w:val="0"/>
                 <w:sz w:val="15"/>
               </w:rPr>
-              <w:t>3. Explicación del Modo Seco y deltas angulares: Justifique técnicamente qué valida el cliente en modo seco (dry_run:=true) y por qué se restringió el desplazamiento de joint_6 a un rango de ±0.05 a ±0.08 rad.</w:t>
+              <w:t>3. Explicación del Modo Seco y deltas angulares: Justifique técnicamente qué valida el cliente en modo seco (dry_run:=true) y por qué el turno mueve joint_1 entre ±0.20 y ±0.30 rad, con max_joint_delta_rad = 0.35 rad, y qué exige de la celda que ese giro desplace todo el brazo.</w:t>
             </w:r>
           </w:p>
         </w:tc>
@@ -9612,7 +9612,7 @@
                 <w:b w:val="0"/>
                 <w:sz w:val="15"/>
               </w:rPr>
-              <w:t>Ejecuta rigurosamente la validación en modo seco (dry_run:=true, código 0), solicita autorización verbal, supervisa la parada de emergencia, ejecuta el movimiento en joint_6 (±0.05 a ±0.08 rad) y llena la Tabla 4.</w:t>
+              <w:t>Ejecuta rigurosamente la validación en modo seco (dry_run:=true, código 0), solicita autorización verbal, supervisa la parada de emergencia, verifica el radio libre de 1.2 m, ejecuta el giro de joint_1 (±0.20 a ±0.30 rad) y llena la Tabla 4.</w:t>
             </w:r>
           </w:p>
         </w:tc>

</xml_diff>